<commit_message>
ajout du wireframe visualisation en détail de la licence (adherent)
</commit_message>
<xml_diff>
--- a/Epreuve E6/Docs AP2/Pages Site Web.docx
+++ b/Epreuve E6/Docs AP2/Pages Site Web.docx
@@ -143,7 +143,7 @@
           <w:sz w:val="24"/>
           <w:szCs w:val="24"/>
         </w:rPr>
-        <w:t xml:space="preserve">Informations sur la licence actuelle, date de validité, catégorie, etc. </w:t>
+        <w:t xml:space="preserve">Informations sur la licence actuelle, date de validité, etc. </w:t>
       </w:r>
     </w:p>
     <w:p>
@@ -729,6 +729,7 @@
           <w:sz w:val="24"/>
           <w:szCs w:val="24"/>
         </w:rPr>
+        <w:lastRenderedPageBreak/>
         <w:t xml:space="preserve">Liste complète des adhérents. </w:t>
       </w:r>
     </w:p>
@@ -1000,12 +1001,11 @@
           <w:numId w:val="41"/>
         </w:numPr>
         <w:ind w:left="1080"/>
-        <w:rPr/>
-      </w:pPr>
-      <w:r>
-        <w:rPr>
-          <w:b w:val="1"/>
-          <w:bCs w:val="1"/>
+      </w:pPr>
+      <w:r>
+        <w:rPr>
+          <w:b/>
+          <w:bCs/>
           <w:sz w:val="24"/>
           <w:szCs w:val="24"/>
         </w:rPr>
@@ -1033,8 +1033,8 @@
       </w:pPr>
       <w:r>
         <w:rPr>
-          <w:b w:val="1"/>
-          <w:bCs w:val="1"/>
+          <w:b/>
+          <w:bCs/>
           <w:sz w:val="24"/>
           <w:szCs w:val="24"/>
         </w:rPr>
@@ -1105,28 +1105,7 @@
           <w:sz w:val="24"/>
           <w:szCs w:val="24"/>
         </w:rPr>
-        <w:t>eme</w:t>
-      </w:r>
-      <w:r>
-        <w:rPr>
-          <w:sz w:val="24"/>
-          <w:szCs w:val="24"/>
-        </w:rPr>
-        <w:t>n</w:t>
-      </w:r>
-      <w:r>
-        <w:rPr>
-          <w:sz w:val="24"/>
-          <w:szCs w:val="24"/>
-        </w:rPr>
-        <w:t>t</w:t>
-      </w:r>
-      <w:r>
-        <w:rPr>
-          <w:sz w:val="24"/>
-          <w:szCs w:val="24"/>
-        </w:rPr>
-        <w:t>...)</w:t>
+        <w:t>ement...)</w:t>
       </w:r>
     </w:p>
     <w:p>
@@ -1147,15 +1126,7 @@
           <w:szCs w:val="24"/>
           <w:lang w:val="fr-FR"/>
         </w:rPr>
-        <w:t xml:space="preserve">Page </w:t>
-      </w:r>
-      <w:r>
-        <w:rPr>
-          <w:sz w:val="24"/>
-          <w:szCs w:val="24"/>
-          <w:lang w:val="fr-FR"/>
-        </w:rPr>
-        <w:t>adm</w:t>
+        <w:t>Page adm</w:t>
       </w:r>
       <w:r>
         <w:rPr>
@@ -1183,48 +1154,19 @@
           <w:szCs w:val="24"/>
           <w:lang w:val="fr-FR"/>
         </w:rPr>
-        <w:t>Page</w:t>
-      </w:r>
-      <w:r>
-        <w:rPr>
-          <w:sz w:val="24"/>
-          <w:szCs w:val="24"/>
-          <w:lang w:val="fr-FR"/>
-        </w:rPr>
-        <w:t xml:space="preserve"> </w:t>
-      </w:r>
-      <w:r>
-        <w:rPr>
-          <w:sz w:val="24"/>
-          <w:szCs w:val="24"/>
-        </w:rPr>
-        <w:t>t</w:t>
-      </w:r>
-      <w:r>
-        <w:rPr>
-          <w:sz w:val="24"/>
-          <w:szCs w:val="24"/>
-        </w:rPr>
-        <w:t>y</w:t>
-      </w:r>
-      <w:r>
-        <w:rPr>
-          <w:sz w:val="24"/>
-          <w:szCs w:val="24"/>
-        </w:rPr>
-        <w:t>pe</w:t>
-      </w:r>
-      <w:r>
-        <w:rPr>
-          <w:sz w:val="24"/>
-          <w:szCs w:val="24"/>
-        </w:rPr>
-        <w:t xml:space="preserve"> d’abonnement</w:t>
+        <w:t xml:space="preserve">Page </w:t>
+      </w:r>
+      <w:r>
+        <w:rPr>
+          <w:sz w:val="24"/>
+          <w:szCs w:val="24"/>
+        </w:rPr>
+        <w:t>type d’abonnement</w:t>
       </w:r>
     </w:p>
     <w:p/>
     <w:sectPr>
-      <w:pgSz w:w="11909" w:h="16834" w:orient="portrait"/>
+      <w:pgSz w:w="11909" w:h="16834"/>
       <w:pgMar w:top="1440" w:right="1440" w:bottom="1440" w:left="1440" w:header="720" w:footer="720" w:gutter="0"/>
       <w:pgNumType w:start="1"/>
       <w:cols w:space="720"/>
@@ -1248,7 +1190,7 @@
         <w:ind w:left="720" w:hanging="360"/>
       </w:pPr>
       <w:rPr>
-        <w:rFonts w:ascii="Arial" w:hAnsi="Arial" w:eastAsia="Arial" w:cs="Arial"/>
+        <w:rFonts w:ascii="Arial" w:eastAsia="Arial" w:hAnsi="Arial" w:cs="Arial"/>
         <w:sz w:val="24"/>
         <w:szCs w:val="24"/>
         <w:u w:val="none"/>
@@ -1364,7 +1306,7 @@
         <w:ind w:left="720" w:hanging="360"/>
       </w:pPr>
       <w:rPr>
-        <w:rFonts w:ascii="Arial" w:hAnsi="Arial" w:eastAsia="Arial" w:cs="Arial"/>
+        <w:rFonts w:ascii="Arial" w:eastAsia="Arial" w:hAnsi="Arial" w:cs="Arial"/>
         <w:sz w:val="24"/>
         <w:szCs w:val="24"/>
         <w:u w:val="none"/>
@@ -1480,7 +1422,7 @@
         <w:ind w:left="720" w:hanging="360"/>
       </w:pPr>
       <w:rPr>
-        <w:rFonts w:ascii="Verdana" w:hAnsi="Verdana" w:eastAsia="Verdana" w:cs="Verdana"/>
+        <w:rFonts w:ascii="Verdana" w:eastAsia="Verdana" w:hAnsi="Verdana" w:cs="Verdana"/>
         <w:sz w:val="24"/>
         <w:szCs w:val="24"/>
         <w:u w:val="none"/>
@@ -1596,7 +1538,7 @@
         <w:ind w:left="720" w:hanging="360"/>
       </w:pPr>
       <w:rPr>
-        <w:rFonts w:ascii="Arial" w:hAnsi="Arial" w:eastAsia="Arial" w:cs="Arial"/>
+        <w:rFonts w:ascii="Arial" w:eastAsia="Arial" w:hAnsi="Arial" w:cs="Arial"/>
         <w:sz w:val="24"/>
         <w:szCs w:val="24"/>
         <w:u w:val="none"/>
@@ -1712,7 +1654,7 @@
         <w:ind w:left="720" w:hanging="360"/>
       </w:pPr>
       <w:rPr>
-        <w:rFonts w:ascii="Arial" w:hAnsi="Arial" w:eastAsia="Arial" w:cs="Arial"/>
+        <w:rFonts w:ascii="Arial" w:eastAsia="Arial" w:hAnsi="Arial" w:cs="Arial"/>
         <w:sz w:val="24"/>
         <w:szCs w:val="24"/>
         <w:u w:val="none"/>
@@ -1828,7 +1770,7 @@
         <w:ind w:left="720" w:hanging="360"/>
       </w:pPr>
       <w:rPr>
-        <w:rFonts w:ascii="Arial" w:hAnsi="Arial" w:eastAsia="Arial" w:cs="Arial"/>
+        <w:rFonts w:ascii="Arial" w:eastAsia="Arial" w:hAnsi="Arial" w:cs="Arial"/>
         <w:sz w:val="24"/>
         <w:szCs w:val="24"/>
         <w:u w:val="none"/>
@@ -1944,7 +1886,7 @@
         <w:ind w:left="720" w:hanging="360"/>
       </w:pPr>
       <w:rPr>
-        <w:rFonts w:ascii="Arial" w:hAnsi="Arial" w:eastAsia="Arial" w:cs="Arial"/>
+        <w:rFonts w:ascii="Arial" w:eastAsia="Arial" w:hAnsi="Arial" w:cs="Arial"/>
         <w:sz w:val="24"/>
         <w:szCs w:val="24"/>
         <w:u w:val="none"/>
@@ -2060,7 +2002,7 @@
         <w:ind w:left="720" w:hanging="360"/>
       </w:pPr>
       <w:rPr>
-        <w:rFonts w:ascii="Arial" w:hAnsi="Arial" w:eastAsia="Arial" w:cs="Arial"/>
+        <w:rFonts w:ascii="Arial" w:eastAsia="Arial" w:hAnsi="Arial" w:cs="Arial"/>
         <w:sz w:val="24"/>
         <w:szCs w:val="24"/>
         <w:u w:val="none"/>
@@ -2176,7 +2118,7 @@
         <w:ind w:left="720" w:hanging="360"/>
       </w:pPr>
       <w:rPr>
-        <w:rFonts w:ascii="Arial" w:hAnsi="Arial" w:eastAsia="Arial" w:cs="Arial"/>
+        <w:rFonts w:ascii="Arial" w:eastAsia="Arial" w:hAnsi="Arial" w:cs="Arial"/>
         <w:sz w:val="24"/>
         <w:szCs w:val="24"/>
         <w:u w:val="none"/>
@@ -2292,7 +2234,7 @@
         <w:ind w:left="720" w:hanging="360"/>
       </w:pPr>
       <w:rPr>
-        <w:rFonts w:ascii="Arial" w:hAnsi="Arial" w:eastAsia="Arial" w:cs="Arial"/>
+        <w:rFonts w:ascii="Arial" w:eastAsia="Arial" w:hAnsi="Arial" w:cs="Arial"/>
         <w:sz w:val="24"/>
         <w:szCs w:val="24"/>
         <w:u w:val="none"/>
@@ -2408,7 +2350,7 @@
         <w:ind w:left="720" w:hanging="360"/>
       </w:pPr>
       <w:rPr>
-        <w:rFonts w:ascii="Arial" w:hAnsi="Arial" w:eastAsia="Arial" w:cs="Arial"/>
+        <w:rFonts w:ascii="Arial" w:eastAsia="Arial" w:hAnsi="Arial" w:cs="Arial"/>
         <w:sz w:val="24"/>
         <w:szCs w:val="24"/>
         <w:u w:val="none"/>
@@ -2524,7 +2466,7 @@
         <w:ind w:left="720" w:hanging="360"/>
       </w:pPr>
       <w:rPr>
-        <w:rFonts w:ascii="Arial" w:hAnsi="Arial" w:eastAsia="Arial" w:cs="Arial"/>
+        <w:rFonts w:ascii="Arial" w:eastAsia="Arial" w:hAnsi="Arial" w:cs="Arial"/>
         <w:sz w:val="24"/>
         <w:szCs w:val="24"/>
         <w:u w:val="none"/>
@@ -2640,7 +2582,7 @@
         <w:ind w:left="720" w:hanging="360"/>
       </w:pPr>
       <w:rPr>
-        <w:rFonts w:ascii="Arial" w:hAnsi="Arial" w:eastAsia="Arial" w:cs="Arial"/>
+        <w:rFonts w:ascii="Arial" w:eastAsia="Arial" w:hAnsi="Arial" w:cs="Arial"/>
         <w:sz w:val="24"/>
         <w:szCs w:val="24"/>
         <w:u w:val="none"/>
@@ -2756,7 +2698,7 @@
         <w:ind w:left="720" w:hanging="360"/>
       </w:pPr>
       <w:rPr>
-        <w:rFonts w:ascii="Arial" w:hAnsi="Arial" w:eastAsia="Arial" w:cs="Arial"/>
+        <w:rFonts w:ascii="Arial" w:eastAsia="Arial" w:hAnsi="Arial" w:cs="Arial"/>
         <w:sz w:val="24"/>
         <w:szCs w:val="24"/>
         <w:u w:val="none"/>
@@ -2872,7 +2814,7 @@
         <w:ind w:left="720" w:hanging="360"/>
       </w:pPr>
       <w:rPr>
-        <w:rFonts w:ascii="Arial" w:hAnsi="Arial" w:eastAsia="Arial" w:cs="Arial"/>
+        <w:rFonts w:ascii="Arial" w:eastAsia="Arial" w:hAnsi="Arial" w:cs="Arial"/>
         <w:sz w:val="24"/>
         <w:szCs w:val="24"/>
         <w:u w:val="none"/>
@@ -2988,7 +2930,7 @@
         <w:ind w:left="720" w:hanging="360"/>
       </w:pPr>
       <w:rPr>
-        <w:rFonts w:ascii="Verdana" w:hAnsi="Verdana" w:eastAsia="Verdana" w:cs="Verdana"/>
+        <w:rFonts w:ascii="Verdana" w:eastAsia="Verdana" w:hAnsi="Verdana" w:cs="Verdana"/>
         <w:sz w:val="24"/>
         <w:szCs w:val="24"/>
         <w:u w:val="none"/>
@@ -3104,7 +3046,7 @@
         <w:ind w:left="720" w:hanging="360"/>
       </w:pPr>
       <w:rPr>
-        <w:rFonts w:ascii="Arial" w:hAnsi="Arial" w:eastAsia="Arial" w:cs="Arial"/>
+        <w:rFonts w:ascii="Arial" w:eastAsia="Arial" w:hAnsi="Arial" w:cs="Arial"/>
         <w:sz w:val="24"/>
         <w:szCs w:val="24"/>
         <w:u w:val="none"/>
@@ -3220,7 +3162,7 @@
         <w:ind w:left="720" w:hanging="360"/>
       </w:pPr>
       <w:rPr>
-        <w:rFonts w:ascii="Arial" w:hAnsi="Arial" w:eastAsia="Arial" w:cs="Arial"/>
+        <w:rFonts w:ascii="Arial" w:eastAsia="Arial" w:hAnsi="Arial" w:cs="Arial"/>
         <w:sz w:val="24"/>
         <w:szCs w:val="24"/>
         <w:u w:val="none"/>
@@ -3336,7 +3278,7 @@
         <w:ind w:left="720" w:hanging="360"/>
       </w:pPr>
       <w:rPr>
-        <w:rFonts w:ascii="Arial" w:hAnsi="Arial" w:eastAsia="Arial" w:cs="Arial"/>
+        <w:rFonts w:ascii="Arial" w:eastAsia="Arial" w:hAnsi="Arial" w:cs="Arial"/>
         <w:sz w:val="24"/>
         <w:szCs w:val="24"/>
         <w:u w:val="none"/>
@@ -3452,7 +3394,7 @@
         <w:ind w:left="720" w:hanging="360"/>
       </w:pPr>
       <w:rPr>
-        <w:rFonts w:ascii="Arial" w:hAnsi="Arial" w:eastAsia="Arial" w:cs="Arial"/>
+        <w:rFonts w:ascii="Arial" w:eastAsia="Arial" w:hAnsi="Arial" w:cs="Arial"/>
         <w:sz w:val="24"/>
         <w:szCs w:val="24"/>
         <w:u w:val="none"/>
@@ -3568,7 +3510,7 @@
         <w:ind w:left="720" w:hanging="360"/>
       </w:pPr>
       <w:rPr>
-        <w:rFonts w:ascii="Arial" w:hAnsi="Arial" w:eastAsia="Arial" w:cs="Arial"/>
+        <w:rFonts w:ascii="Arial" w:eastAsia="Arial" w:hAnsi="Arial" w:cs="Arial"/>
         <w:sz w:val="24"/>
         <w:szCs w:val="24"/>
         <w:u w:val="none"/>
@@ -3684,7 +3626,7 @@
         <w:ind w:left="720" w:hanging="360"/>
       </w:pPr>
       <w:rPr>
-        <w:rFonts w:ascii="Arial" w:hAnsi="Arial" w:eastAsia="Arial" w:cs="Arial"/>
+        <w:rFonts w:ascii="Arial" w:eastAsia="Arial" w:hAnsi="Arial" w:cs="Arial"/>
         <w:sz w:val="24"/>
         <w:szCs w:val="24"/>
         <w:u w:val="none"/>
@@ -3800,7 +3742,7 @@
         <w:ind w:left="720" w:hanging="360"/>
       </w:pPr>
       <w:rPr>
-        <w:rFonts w:ascii="Arial" w:hAnsi="Arial" w:eastAsia="Arial" w:cs="Arial"/>
+        <w:rFonts w:ascii="Arial" w:eastAsia="Arial" w:hAnsi="Arial" w:cs="Arial"/>
         <w:sz w:val="24"/>
         <w:szCs w:val="24"/>
         <w:u w:val="none"/>
@@ -3916,7 +3858,7 @@
         <w:ind w:left="720" w:hanging="360"/>
       </w:pPr>
       <w:rPr>
-        <w:rFonts w:ascii="Arial" w:hAnsi="Arial" w:eastAsia="Arial" w:cs="Arial"/>
+        <w:rFonts w:ascii="Arial" w:eastAsia="Arial" w:hAnsi="Arial" w:cs="Arial"/>
         <w:sz w:val="24"/>
         <w:szCs w:val="24"/>
         <w:u w:val="none"/>
@@ -4032,7 +3974,7 @@
         <w:ind w:left="720" w:hanging="360"/>
       </w:pPr>
       <w:rPr>
-        <w:rFonts w:ascii="Arial" w:hAnsi="Arial" w:eastAsia="Arial" w:cs="Arial"/>
+        <w:rFonts w:ascii="Arial" w:eastAsia="Arial" w:hAnsi="Arial" w:cs="Arial"/>
         <w:sz w:val="24"/>
         <w:szCs w:val="24"/>
         <w:u w:val="none"/>
@@ -4148,7 +4090,7 @@
         <w:ind w:left="720" w:hanging="360"/>
       </w:pPr>
       <w:rPr>
-        <w:rFonts w:ascii="Arial" w:hAnsi="Arial" w:eastAsia="Arial" w:cs="Arial"/>
+        <w:rFonts w:ascii="Arial" w:eastAsia="Arial" w:hAnsi="Arial" w:cs="Arial"/>
         <w:sz w:val="24"/>
         <w:szCs w:val="24"/>
         <w:u w:val="none"/>
@@ -4264,7 +4206,7 @@
         <w:ind w:left="720" w:hanging="360"/>
       </w:pPr>
       <w:rPr>
-        <w:rFonts w:ascii="Arial" w:hAnsi="Arial" w:eastAsia="Arial" w:cs="Arial"/>
+        <w:rFonts w:ascii="Arial" w:eastAsia="Arial" w:hAnsi="Arial" w:cs="Arial"/>
         <w:sz w:val="24"/>
         <w:szCs w:val="24"/>
         <w:u w:val="none"/>
@@ -4380,7 +4322,7 @@
         <w:ind w:left="720" w:hanging="360"/>
       </w:pPr>
       <w:rPr>
-        <w:rFonts w:ascii="Arial" w:hAnsi="Arial" w:eastAsia="Arial" w:cs="Arial"/>
+        <w:rFonts w:ascii="Arial" w:eastAsia="Arial" w:hAnsi="Arial" w:cs="Arial"/>
         <w:sz w:val="24"/>
         <w:szCs w:val="24"/>
         <w:u w:val="none"/>
@@ -4496,7 +4438,7 @@
         <w:ind w:left="720" w:hanging="360"/>
       </w:pPr>
       <w:rPr>
-        <w:rFonts w:ascii="Verdana" w:hAnsi="Verdana" w:eastAsia="Verdana" w:cs="Verdana"/>
+        <w:rFonts w:ascii="Verdana" w:eastAsia="Verdana" w:hAnsi="Verdana" w:cs="Verdana"/>
         <w:sz w:val="24"/>
         <w:szCs w:val="24"/>
         <w:u w:val="none"/>
@@ -4612,7 +4554,7 @@
         <w:ind w:left="720" w:hanging="360"/>
       </w:pPr>
       <w:rPr>
-        <w:rFonts w:ascii="Arial" w:hAnsi="Arial" w:eastAsia="Arial" w:cs="Arial"/>
+        <w:rFonts w:ascii="Arial" w:eastAsia="Arial" w:hAnsi="Arial" w:cs="Arial"/>
         <w:sz w:val="24"/>
         <w:szCs w:val="24"/>
         <w:u w:val="none"/>
@@ -4728,7 +4670,7 @@
         <w:ind w:left="720" w:hanging="360"/>
       </w:pPr>
       <w:rPr>
-        <w:rFonts w:ascii="Arial" w:hAnsi="Arial" w:eastAsia="Arial" w:cs="Arial"/>
+        <w:rFonts w:ascii="Arial" w:eastAsia="Arial" w:hAnsi="Arial" w:cs="Arial"/>
         <w:sz w:val="24"/>
         <w:szCs w:val="24"/>
         <w:u w:val="none"/>
@@ -4844,7 +4786,7 @@
         <w:ind w:left="720" w:hanging="360"/>
       </w:pPr>
       <w:rPr>
-        <w:rFonts w:ascii="Arial" w:hAnsi="Arial" w:eastAsia="Arial" w:cs="Arial"/>
+        <w:rFonts w:ascii="Arial" w:eastAsia="Arial" w:hAnsi="Arial" w:cs="Arial"/>
         <w:sz w:val="24"/>
         <w:szCs w:val="24"/>
         <w:u w:val="none"/>
@@ -4960,7 +4902,7 @@
         <w:ind w:left="720" w:hanging="360"/>
       </w:pPr>
       <w:rPr>
-        <w:rFonts w:ascii="Arial" w:hAnsi="Arial" w:eastAsia="Arial" w:cs="Arial"/>
+        <w:rFonts w:ascii="Arial" w:eastAsia="Arial" w:hAnsi="Arial" w:cs="Arial"/>
         <w:sz w:val="24"/>
         <w:szCs w:val="24"/>
         <w:u w:val="none"/>
@@ -5076,7 +5018,7 @@
         <w:ind w:left="720" w:hanging="360"/>
       </w:pPr>
       <w:rPr>
-        <w:rFonts w:ascii="Arial" w:hAnsi="Arial" w:eastAsia="Arial" w:cs="Arial"/>
+        <w:rFonts w:ascii="Arial" w:eastAsia="Arial" w:hAnsi="Arial" w:cs="Arial"/>
         <w:sz w:val="24"/>
         <w:szCs w:val="24"/>
         <w:u w:val="none"/>
@@ -5192,7 +5134,7 @@
         <w:ind w:left="720" w:hanging="360"/>
       </w:pPr>
       <w:rPr>
-        <w:rFonts w:ascii="Arial" w:hAnsi="Arial" w:eastAsia="Arial" w:cs="Arial"/>
+        <w:rFonts w:ascii="Arial" w:eastAsia="Arial" w:hAnsi="Arial" w:cs="Arial"/>
         <w:sz w:val="24"/>
         <w:szCs w:val="24"/>
         <w:u w:val="none"/>
@@ -5308,7 +5250,7 @@
         <w:ind w:left="720" w:hanging="360"/>
       </w:pPr>
       <w:rPr>
-        <w:rFonts w:ascii="Verdana" w:hAnsi="Verdana" w:eastAsia="Verdana" w:cs="Verdana"/>
+        <w:rFonts w:ascii="Verdana" w:eastAsia="Verdana" w:hAnsi="Verdana" w:cs="Verdana"/>
         <w:sz w:val="24"/>
         <w:szCs w:val="24"/>
         <w:u w:val="none"/>
@@ -5424,7 +5366,7 @@
         <w:ind w:left="720" w:hanging="360"/>
       </w:pPr>
       <w:rPr>
-        <w:rFonts w:ascii="Arial" w:hAnsi="Arial" w:eastAsia="Arial" w:cs="Arial"/>
+        <w:rFonts w:ascii="Arial" w:eastAsia="Arial" w:hAnsi="Arial" w:cs="Arial"/>
         <w:sz w:val="24"/>
         <w:szCs w:val="24"/>
         <w:u w:val="none"/>
@@ -5540,7 +5482,7 @@
         <w:ind w:left="720" w:hanging="360"/>
       </w:pPr>
       <w:rPr>
-        <w:rFonts w:ascii="Arial" w:hAnsi="Arial" w:eastAsia="Arial" w:cs="Arial"/>
+        <w:rFonts w:ascii="Arial" w:eastAsia="Arial" w:hAnsi="Arial" w:cs="Arial"/>
         <w:sz w:val="24"/>
         <w:szCs w:val="24"/>
         <w:u w:val="none"/>
@@ -5656,7 +5598,7 @@
         <w:ind w:left="720" w:hanging="360"/>
       </w:pPr>
       <w:rPr>
-        <w:rFonts w:ascii="Arial" w:hAnsi="Arial" w:eastAsia="Arial" w:cs="Arial"/>
+        <w:rFonts w:ascii="Arial" w:eastAsia="Arial" w:hAnsi="Arial" w:cs="Arial"/>
         <w:sz w:val="24"/>
         <w:szCs w:val="24"/>
         <w:u w:val="none"/>
@@ -5772,7 +5714,7 @@
         <w:ind w:left="720" w:hanging="360"/>
       </w:pPr>
       <w:rPr>
-        <w:rFonts w:ascii="Arial" w:hAnsi="Arial" w:eastAsia="Arial" w:cs="Arial"/>
+        <w:rFonts w:ascii="Arial" w:eastAsia="Arial" w:hAnsi="Arial" w:cs="Arial"/>
         <w:sz w:val="24"/>
         <w:szCs w:val="24"/>
         <w:u w:val="none"/>
@@ -5888,7 +5830,7 @@
         <w:ind w:left="720" w:hanging="360"/>
       </w:pPr>
       <w:rPr>
-        <w:rFonts w:ascii="Arial" w:hAnsi="Arial" w:eastAsia="Arial" w:cs="Arial"/>
+        <w:rFonts w:ascii="Arial" w:eastAsia="Arial" w:hAnsi="Arial" w:cs="Arial"/>
         <w:sz w:val="24"/>
         <w:szCs w:val="24"/>
         <w:u w:val="none"/>
@@ -6004,7 +5946,7 @@
         <w:ind w:left="720" w:hanging="360"/>
       </w:pPr>
       <w:rPr>
-        <w:rFonts w:ascii="Verdana" w:hAnsi="Verdana" w:eastAsia="Verdana" w:cs="Verdana"/>
+        <w:rFonts w:ascii="Verdana" w:eastAsia="Verdana" w:hAnsi="Verdana" w:cs="Verdana"/>
         <w:sz w:val="24"/>
         <w:szCs w:val="24"/>
         <w:u w:val="none"/>
@@ -6120,7 +6062,7 @@
         <w:ind w:left="720" w:hanging="360"/>
       </w:pPr>
       <w:rPr>
-        <w:rFonts w:ascii="Arial" w:hAnsi="Arial" w:eastAsia="Arial" w:cs="Arial"/>
+        <w:rFonts w:ascii="Arial" w:eastAsia="Arial" w:hAnsi="Arial" w:cs="Arial"/>
         <w:sz w:val="24"/>
         <w:szCs w:val="24"/>
         <w:u w:val="none"/>
@@ -6360,7 +6302,7 @@
   <w:docDefaults>
     <w:rPrDefault>
       <w:rPr>
-        <w:rFonts w:ascii="Arial" w:hAnsi="Arial" w:eastAsia="Arial" w:cs="Arial"/>
+        <w:rFonts w:ascii="Arial" w:eastAsia="Arial" w:hAnsi="Arial" w:cs="Arial"/>
         <w:sz w:val="22"/>
         <w:szCs w:val="22"/>
         <w:lang w:val="fr" w:eastAsia="ja-JP" w:bidi="ar-SA"/>
@@ -6375,14 +6317,14 @@
   <w:latentStyles w:defLockedState="0" w:defUIPriority="99" w:defSemiHidden="0" w:defUnhideWhenUsed="0" w:defQFormat="0" w:count="376">
     <w:lsdException w:name="Normal" w:uiPriority="0" w:qFormat="1"/>
     <w:lsdException w:name="heading 1" w:uiPriority="9" w:qFormat="1"/>
-    <w:lsdException w:name="heading 2" w:uiPriority="9" w:semiHidden="1" w:unhideWhenUsed="1" w:qFormat="1"/>
-    <w:lsdException w:name="heading 3" w:uiPriority="9" w:semiHidden="1" w:unhideWhenUsed="1" w:qFormat="1"/>
-    <w:lsdException w:name="heading 4" w:uiPriority="9" w:semiHidden="1" w:unhideWhenUsed="1" w:qFormat="1"/>
-    <w:lsdException w:name="heading 5" w:uiPriority="9" w:semiHidden="1" w:unhideWhenUsed="1" w:qFormat="1"/>
-    <w:lsdException w:name="heading 6" w:uiPriority="9" w:semiHidden="1" w:unhideWhenUsed="1" w:qFormat="1"/>
-    <w:lsdException w:name="heading 7" w:uiPriority="9" w:semiHidden="1" w:unhideWhenUsed="1" w:qFormat="1"/>
-    <w:lsdException w:name="heading 8" w:uiPriority="9" w:semiHidden="1" w:unhideWhenUsed="1" w:qFormat="1"/>
-    <w:lsdException w:name="heading 9" w:uiPriority="9" w:semiHidden="1" w:unhideWhenUsed="1" w:qFormat="1"/>
+    <w:lsdException w:name="heading 2" w:semiHidden="1" w:uiPriority="9" w:unhideWhenUsed="1" w:qFormat="1"/>
+    <w:lsdException w:name="heading 3" w:semiHidden="1" w:uiPriority="9" w:unhideWhenUsed="1" w:qFormat="1"/>
+    <w:lsdException w:name="heading 4" w:semiHidden="1" w:uiPriority="9" w:unhideWhenUsed="1" w:qFormat="1"/>
+    <w:lsdException w:name="heading 5" w:semiHidden="1" w:uiPriority="9" w:unhideWhenUsed="1" w:qFormat="1"/>
+    <w:lsdException w:name="heading 6" w:semiHidden="1" w:uiPriority="9" w:unhideWhenUsed="1" w:qFormat="1"/>
+    <w:lsdException w:name="heading 7" w:semiHidden="1" w:uiPriority="9" w:unhideWhenUsed="1" w:qFormat="1"/>
+    <w:lsdException w:name="heading 8" w:semiHidden="1" w:uiPriority="9" w:unhideWhenUsed="1" w:qFormat="1"/>
+    <w:lsdException w:name="heading 9" w:semiHidden="1" w:uiPriority="9" w:unhideWhenUsed="1" w:qFormat="1"/>
     <w:lsdException w:name="index 1" w:semiHidden="1" w:unhideWhenUsed="1"/>
     <w:lsdException w:name="index 2" w:semiHidden="1" w:unhideWhenUsed="1"/>
     <w:lsdException w:name="index 3" w:semiHidden="1" w:unhideWhenUsed="1"/>
@@ -6392,22 +6334,22 @@
     <w:lsdException w:name="index 7" w:semiHidden="1" w:unhideWhenUsed="1"/>
     <w:lsdException w:name="index 8" w:semiHidden="1" w:unhideWhenUsed="1"/>
     <w:lsdException w:name="index 9" w:semiHidden="1" w:unhideWhenUsed="1"/>
-    <w:lsdException w:name="toc 1" w:uiPriority="39" w:semiHidden="1" w:unhideWhenUsed="1"/>
-    <w:lsdException w:name="toc 2" w:uiPriority="39" w:semiHidden="1" w:unhideWhenUsed="1"/>
-    <w:lsdException w:name="toc 3" w:uiPriority="39" w:semiHidden="1" w:unhideWhenUsed="1"/>
-    <w:lsdException w:name="toc 4" w:uiPriority="39" w:semiHidden="1" w:unhideWhenUsed="1"/>
-    <w:lsdException w:name="toc 5" w:uiPriority="39" w:semiHidden="1" w:unhideWhenUsed="1"/>
-    <w:lsdException w:name="toc 6" w:uiPriority="39" w:semiHidden="1" w:unhideWhenUsed="1"/>
-    <w:lsdException w:name="toc 7" w:uiPriority="39" w:semiHidden="1" w:unhideWhenUsed="1"/>
-    <w:lsdException w:name="toc 8" w:uiPriority="39" w:semiHidden="1" w:unhideWhenUsed="1"/>
-    <w:lsdException w:name="toc 9" w:uiPriority="39" w:semiHidden="1" w:unhideWhenUsed="1"/>
+    <w:lsdException w:name="toc 1" w:semiHidden="1" w:uiPriority="39" w:unhideWhenUsed="1"/>
+    <w:lsdException w:name="toc 2" w:semiHidden="1" w:uiPriority="39" w:unhideWhenUsed="1"/>
+    <w:lsdException w:name="toc 3" w:semiHidden="1" w:uiPriority="39" w:unhideWhenUsed="1"/>
+    <w:lsdException w:name="toc 4" w:semiHidden="1" w:uiPriority="39" w:unhideWhenUsed="1"/>
+    <w:lsdException w:name="toc 5" w:semiHidden="1" w:uiPriority="39" w:unhideWhenUsed="1"/>
+    <w:lsdException w:name="toc 6" w:semiHidden="1" w:uiPriority="39" w:unhideWhenUsed="1"/>
+    <w:lsdException w:name="toc 7" w:semiHidden="1" w:uiPriority="39" w:unhideWhenUsed="1"/>
+    <w:lsdException w:name="toc 8" w:semiHidden="1" w:uiPriority="39" w:unhideWhenUsed="1"/>
+    <w:lsdException w:name="toc 9" w:semiHidden="1" w:uiPriority="39" w:unhideWhenUsed="1"/>
     <w:lsdException w:name="Normal Indent" w:semiHidden="1" w:unhideWhenUsed="1"/>
     <w:lsdException w:name="footnote text" w:semiHidden="1" w:unhideWhenUsed="1"/>
     <w:lsdException w:name="annotation text" w:semiHidden="1" w:unhideWhenUsed="1"/>
     <w:lsdException w:name="header" w:semiHidden="1" w:unhideWhenUsed="1"/>
     <w:lsdException w:name="footer" w:semiHidden="1" w:unhideWhenUsed="1"/>
     <w:lsdException w:name="index heading" w:semiHidden="1" w:unhideWhenUsed="1"/>
-    <w:lsdException w:name="caption" w:uiPriority="35" w:semiHidden="1" w:unhideWhenUsed="1" w:qFormat="1"/>
+    <w:lsdException w:name="caption" w:semiHidden="1" w:uiPriority="35" w:unhideWhenUsed="1" w:qFormat="1"/>
     <w:lsdException w:name="table of figures" w:semiHidden="1" w:unhideWhenUsed="1"/>
     <w:lsdException w:name="envelope address" w:semiHidden="1" w:unhideWhenUsed="1"/>
     <w:lsdException w:name="envelope return" w:semiHidden="1" w:unhideWhenUsed="1"/>
@@ -6438,7 +6380,7 @@
     <w:lsdException w:name="Title" w:uiPriority="10" w:qFormat="1"/>
     <w:lsdException w:name="Closing" w:semiHidden="1" w:unhideWhenUsed="1"/>
     <w:lsdException w:name="Signature" w:semiHidden="1" w:unhideWhenUsed="1"/>
-    <w:lsdException w:name="Default Paragraph Font" w:uiPriority="1" w:semiHidden="1" w:unhideWhenUsed="1"/>
+    <w:lsdException w:name="Default Paragraph Font" w:semiHidden="1" w:uiPriority="1" w:unhideWhenUsed="1"/>
     <w:lsdException w:name="Body Text" w:semiHidden="1" w:unhideWhenUsed="1"/>
     <w:lsdException w:name="Body Text Indent" w:semiHidden="1" w:unhideWhenUsed="1"/>
     <w:lsdException w:name="List Continue" w:semiHidden="1" w:unhideWhenUsed="1"/>
@@ -6638,8 +6580,8 @@
     <w:lsdException w:name="Subtle Reference" w:uiPriority="31" w:qFormat="1"/>
     <w:lsdException w:name="Intense Reference" w:uiPriority="32" w:qFormat="1"/>
     <w:lsdException w:name="Book Title" w:uiPriority="33" w:qFormat="1"/>
-    <w:lsdException w:name="Bibliography" w:uiPriority="37" w:semiHidden="1" w:unhideWhenUsed="1"/>
-    <w:lsdException w:name="TOC Heading" w:uiPriority="39" w:semiHidden="1" w:unhideWhenUsed="1" w:qFormat="1"/>
+    <w:lsdException w:name="Bibliography" w:semiHidden="1" w:uiPriority="37" w:unhideWhenUsed="1"/>
+    <w:lsdException w:name="TOC Heading" w:semiHidden="1" w:uiPriority="39" w:unhideWhenUsed="1" w:qFormat="1"/>
     <w:lsdException w:name="Plain Table 1" w:uiPriority="41"/>
     <w:lsdException w:name="Plain Table 2" w:uiPriority="42"/>
     <w:lsdException w:name="Plain Table 3" w:uiPriority="43"/>
@@ -6750,7 +6692,7 @@
     <w:lsdException w:name="Unresolved Mention" w:semiHidden="1" w:unhideWhenUsed="1"/>
     <w:lsdException w:name="Smart Link" w:semiHidden="1" w:unhideWhenUsed="1"/>
   </w:latentStyles>
-  <w:style w:type="paragraph" w:styleId="Normal" w:default="1">
+  <w:style w:type="paragraph" w:default="1" w:styleId="Normal">
     <w:name w:val="Normal"/>
     <w:qFormat/>
   </w:style>
@@ -6867,13 +6809,13 @@
       <w:color w:val="666666"/>
     </w:rPr>
   </w:style>
-  <w:style w:type="character" w:styleId="Policepardfaut" w:default="1">
+  <w:style w:type="character" w:default="1" w:styleId="Policepardfaut">
     <w:name w:val="Default Paragraph Font"/>
     <w:uiPriority w:val="1"/>
     <w:semiHidden/>
     <w:unhideWhenUsed/>
   </w:style>
-  <w:style w:type="table" w:styleId="TableauNormal" w:default="1">
+  <w:style w:type="table" w:default="1" w:styleId="TableauNormal">
     <w:name w:val="Normal Table"/>
     <w:uiPriority w:val="99"/>
     <w:semiHidden/>
@@ -6888,13 +6830,13 @@
       </w:tblCellMar>
     </w:tblPr>
   </w:style>
-  <w:style w:type="numbering" w:styleId="Aucuneliste" w:default="1">
+  <w:style w:type="numbering" w:default="1" w:styleId="Aucuneliste">
     <w:name w:val="No List"/>
     <w:uiPriority w:val="99"/>
     <w:semiHidden/>
     <w:unhideWhenUsed/>
   </w:style>
-  <w:style w:type="table" w:styleId="TableNormal" w:customStyle="1">
+  <w:style w:type="table" w:customStyle="1" w:styleId="TableNormal">
     <w:name w:val="TableNormal"/>
     <w:tblPr>
       <w:tblCellMar>
@@ -7262,12 +7204,14 @@
 </file>
 
 <file path=customXml/item1.xml><?xml version="1.0" encoding="utf-8"?>
-<?mso-contentType ?>
-<FormTemplates xmlns="http://schemas.microsoft.com/sharepoint/v3/contenttype/forms">
-  <Display>DocumentLibraryForm</Display>
-  <Edit>DocumentLibraryForm</Edit>
-  <New>DocumentLibraryForm</New>
-</FormTemplates>
+<p:properties xmlns:p="http://schemas.microsoft.com/office/2006/metadata/properties" xmlns:xsi="http://www.w3.org/2001/XMLSchema-instance" xmlns:pc="http://schemas.microsoft.com/office/infopath/2007/PartnerControls">
+  <documentManagement>
+    <TaxCatchAll xmlns="9877842e-127a-4c45-b612-0f554330d3bc" xsi:nil="true"/>
+    <lcf76f155ced4ddcb4097134ff3c332f xmlns="79be6eb5-5a93-495e-80bf-d6e3ad465d9e">
+      <Terms xmlns="http://schemas.microsoft.com/office/infopath/2007/PartnerControls"/>
+    </lcf76f155ced4ddcb4097134ff3c332f>
+  </documentManagement>
+</p:properties>
 </file>
 
 <file path=customXml/item2.xml><?xml version="1.0" encoding="utf-8"?>
@@ -7460,29 +7404,15 @@
 </file>
 
 <file path=customXml/item3.xml><?xml version="1.0" encoding="utf-8"?>
-<p:properties xmlns:p="http://schemas.microsoft.com/office/2006/metadata/properties" xmlns:xsi="http://www.w3.org/2001/XMLSchema-instance" xmlns:pc="http://schemas.microsoft.com/office/infopath/2007/PartnerControls">
-  <documentManagement>
-    <TaxCatchAll xmlns="9877842e-127a-4c45-b612-0f554330d3bc" xsi:nil="true"/>
-    <lcf76f155ced4ddcb4097134ff3c332f xmlns="79be6eb5-5a93-495e-80bf-d6e3ad465d9e">
-      <Terms xmlns="http://schemas.microsoft.com/office/infopath/2007/PartnerControls"/>
-    </lcf76f155ced4ddcb4097134ff3c332f>
-  </documentManagement>
-</p:properties>
+<?mso-contentType ?>
+<FormTemplates xmlns="http://schemas.microsoft.com/sharepoint/v3/contenttype/forms">
+  <Display>DocumentLibraryForm</Display>
+  <Edit>DocumentLibraryForm</Edit>
+  <New>DocumentLibraryForm</New>
+</FormTemplates>
 </file>
 
 <file path=customXml/itemProps1.xml><?xml version="1.0" encoding="utf-8"?>
-<ds:datastoreItem xmlns:ds="http://schemas.openxmlformats.org/officeDocument/2006/customXml" ds:itemID="{33806351-7DE9-418B-AC0B-6454B6FD78FA}">
-  <ds:schemaRefs>
-    <ds:schemaRef ds:uri="http://schemas.microsoft.com/sharepoint/v3/contenttype/forms"/>
-  </ds:schemaRefs>
-</ds:datastoreItem>
-</file>
-
-<file path=customXml/itemProps2.xml><?xml version="1.0" encoding="utf-8"?>
-<ds:datastoreItem xmlns:ds="http://schemas.openxmlformats.org/officeDocument/2006/customXml" ds:itemID="{3CC5B5B0-1644-4E23-A4AD-F3B460DCF115}"/>
-</file>
-
-<file path=customXml/itemProps3.xml><?xml version="1.0" encoding="utf-8"?>
 <ds:datastoreItem xmlns:ds="http://schemas.openxmlformats.org/officeDocument/2006/customXml" ds:itemID="{46A6DCAC-1000-403B-B900-0DE7A262DE84}">
   <ds:schemaRefs>
     <ds:schemaRef ds:uri="http://schemas.microsoft.com/office/2006/metadata/properties"/>
@@ -7491,4 +7421,31 @@
     <ds:schemaRef ds:uri="79be6eb5-5a93-495e-80bf-d6e3ad465d9e"/>
   </ds:schemaRefs>
 </ds:datastoreItem>
+</file>
+
+<file path=customXml/itemProps2.xml><?xml version="1.0" encoding="utf-8"?>
+<ds:datastoreItem xmlns:ds="http://schemas.openxmlformats.org/officeDocument/2006/customXml" ds:itemID="{3CC5B5B0-1644-4E23-A4AD-F3B460DCF115}">
+  <ds:schemaRefs>
+    <ds:schemaRef ds:uri="http://schemas.microsoft.com/office/2006/metadata/contentType"/>
+    <ds:schemaRef ds:uri="http://schemas.microsoft.com/office/2006/metadata/properties/metaAttributes"/>
+    <ds:schemaRef ds:uri="http://www.w3.org/2001/XMLSchema"/>
+    <ds:schemaRef ds:uri="http://schemas.microsoft.com/office/2006/metadata/properties"/>
+    <ds:schemaRef ds:uri="79be6eb5-5a93-495e-80bf-d6e3ad465d9e"/>
+    <ds:schemaRef ds:uri="9877842e-127a-4c45-b612-0f554330d3bc"/>
+    <ds:schemaRef ds:uri="http://schemas.microsoft.com/office/2006/documentManagement/types"/>
+    <ds:schemaRef ds:uri="http://schemas.microsoft.com/office/infopath/2007/PartnerControls"/>
+    <ds:schemaRef ds:uri="http://schemas.openxmlformats.org/package/2006/metadata/core-properties"/>
+    <ds:schemaRef ds:uri="http://purl.org/dc/elements/1.1/"/>
+    <ds:schemaRef ds:uri="http://purl.org/dc/terms/"/>
+    <ds:schemaRef ds:uri="http://schemas.microsoft.com/internal/obd"/>
+  </ds:schemaRefs>
+</ds:datastoreItem>
+</file>
+
+<file path=customXml/itemProps3.xml><?xml version="1.0" encoding="utf-8"?>
+<ds:datastoreItem xmlns:ds="http://schemas.openxmlformats.org/officeDocument/2006/customXml" ds:itemID="{33806351-7DE9-418B-AC0B-6454B6FD78FA}">
+  <ds:schemaRefs>
+    <ds:schemaRef ds:uri="http://schemas.microsoft.com/sharepoint/v3/contenttype/forms"/>
+  </ds:schemaRefs>
+</ds:datastoreItem>
 </file>
</xml_diff>